<commit_message>
Fix Lab13 final Problem 6 label output in Rmd and docx
</commit_message>
<xml_diff>
--- a/Lab13/lab13_output/Lab_13_final.docx
+++ b/Lab13/lab13_output/Lab_13_final.docx
@@ -19114,6 +19114,270 @@
       </w:pPr>
       <w:r>
         <w:rPr>
+          <w:rStyle w:val="ControlFlowTok"/>
+        </w:rPr>
+        <w:t xml:space="preserve">if</w:t>
+      </w:r>
+      <w:r>
+        <w:rPr>
+          <w:rStyle w:val="NormalTok"/>
+        </w:rPr>
+        <w:t xml:space="preserve"> (</w:t>
+      </w:r>
+      <w:r>
+        <w:rPr>
+          <w:rStyle w:val="FunctionTok"/>
+        </w:rPr>
+        <w:t xml:space="preserve">is.null</w:t>
+      </w:r>
+      <w:r>
+        <w:rPr>
+          <w:rStyle w:val="NormalTok"/>
+        </w:rPr>
+        <w:t xml:space="preserve">(</w:t>
+      </w:r>
+      <w:r>
+        <w:rPr>
+          <w:rStyle w:val="FunctionTok"/>
+        </w:rPr>
+        <w:t xml:space="preserve">attributes</w:t>
+      </w:r>
+      <w:r>
+        <w:rPr>
+          <w:rStyle w:val="NormalTok"/>
+        </w:rPr>
+        <w:t xml:space="preserve">(stdata)[[</w:t>
+      </w:r>
+      <w:r>
+        <w:rPr>
+          <w:rStyle w:val="StringTok"/>
+        </w:rPr>
+        <w:t xml:space="preserve">"variable.labels"</w:t>
+      </w:r>
+      <w:r>
+        <w:rPr>
+          <w:rStyle w:val="NormalTok"/>
+        </w:rPr>
+        <w:t xml:space="preserve">]])) {</w:t>
+      </w:r>
+      <w:r>
+        <w:br/>
+      </w:r>
+      <w:r>
+        <w:rPr>
+          <w:rStyle w:val="NormalTok"/>
+        </w:rPr>
+        <w:t xml:space="preserve">  </w:t>
+      </w:r>
+      <w:r>
+        <w:rPr>
+          <w:rStyle w:val="FunctionTok"/>
+        </w:rPr>
+        <w:t xml:space="preserve">attr</w:t>
+      </w:r>
+      <w:r>
+        <w:rPr>
+          <w:rStyle w:val="NormalTok"/>
+        </w:rPr>
+        <w:t xml:space="preserve">(stdata, </w:t>
+      </w:r>
+      <w:r>
+        <w:rPr>
+          <w:rStyle w:val="StringTok"/>
+        </w:rPr>
+        <w:t xml:space="preserve">"variable.labels"</w:t>
+      </w:r>
+      <w:r>
+        <w:rPr>
+          <w:rStyle w:val="NormalTok"/>
+        </w:rPr>
+        <w:t xml:space="preserve">) </w:t>
+      </w:r>
+      <w:r>
+        <w:rPr>
+          <w:rStyle w:val="OtherTok"/>
+        </w:rPr>
+        <w:t xml:space="preserve">&lt;-</w:t>
+      </w:r>
+      <w:r>
+        <w:rPr>
+          <w:rStyle w:val="NormalTok"/>
+        </w:rPr>
+        <w:t xml:space="preserve"> </w:t>
+      </w:r>
+      <w:r>
+        <w:rPr>
+          <w:rStyle w:val="FunctionTok"/>
+        </w:rPr>
+        <w:t xml:space="preserve">vapply</w:t>
+      </w:r>
+      <w:r>
+        <w:rPr>
+          <w:rStyle w:val="NormalTok"/>
+        </w:rPr>
+        <w:t xml:space="preserve">(stdata, </w:t>
+      </w:r>
+      <w:r>
+        <w:rPr>
+          <w:rStyle w:val="ControlFlowTok"/>
+        </w:rPr>
+        <w:t xml:space="preserve">function</w:t>
+      </w:r>
+      <w:r>
+        <w:rPr>
+          <w:rStyle w:val="NormalTok"/>
+        </w:rPr>
+        <w:t xml:space="preserve">(x) {</w:t>
+      </w:r>
+      <w:r>
+        <w:br/>
+      </w:r>
+      <w:r>
+        <w:rPr>
+          <w:rStyle w:val="NormalTok"/>
+        </w:rPr>
+        <w:t xml:space="preserve">    lbl </w:t>
+      </w:r>
+      <w:r>
+        <w:rPr>
+          <w:rStyle w:val="OtherTok"/>
+        </w:rPr>
+        <w:t xml:space="preserve">&lt;-</w:t>
+      </w:r>
+      <w:r>
+        <w:rPr>
+          <w:rStyle w:val="NormalTok"/>
+        </w:rPr>
+        <w:t xml:space="preserve"> </w:t>
+      </w:r>
+      <w:r>
+        <w:rPr>
+          <w:rStyle w:val="FunctionTok"/>
+        </w:rPr>
+        <w:t xml:space="preserve">attr</w:t>
+      </w:r>
+      <w:r>
+        <w:rPr>
+          <w:rStyle w:val="NormalTok"/>
+        </w:rPr>
+        <w:t xml:space="preserve">(x, </w:t>
+      </w:r>
+      <w:r>
+        <w:rPr>
+          <w:rStyle w:val="StringTok"/>
+        </w:rPr>
+        <w:t xml:space="preserve">"label"</w:t>
+      </w:r>
+      <w:r>
+        <w:rPr>
+          <w:rStyle w:val="NormalTok"/>
+        </w:rPr>
+        <w:t xml:space="preserve">)</w:t>
+      </w:r>
+      <w:r>
+        <w:br/>
+      </w:r>
+      <w:r>
+        <w:rPr>
+          <w:rStyle w:val="NormalTok"/>
+        </w:rPr>
+        <w:t xml:space="preserve">    </w:t>
+      </w:r>
+      <w:r>
+        <w:rPr>
+          <w:rStyle w:val="ControlFlowTok"/>
+        </w:rPr>
+        <w:t xml:space="preserve">if</w:t>
+      </w:r>
+      <w:r>
+        <w:rPr>
+          <w:rStyle w:val="NormalTok"/>
+        </w:rPr>
+        <w:t xml:space="preserve"> (</w:t>
+      </w:r>
+      <w:r>
+        <w:rPr>
+          <w:rStyle w:val="FunctionTok"/>
+        </w:rPr>
+        <w:t xml:space="preserve">is.null</w:t>
+      </w:r>
+      <w:r>
+        <w:rPr>
+          <w:rStyle w:val="NormalTok"/>
+        </w:rPr>
+        <w:t xml:space="preserve">(lbl)) </w:t>
+      </w:r>
+      <w:r>
+        <w:rPr>
+          <w:rStyle w:val="ConstantTok"/>
+        </w:rPr>
+        <w:t xml:space="preserve">NA_character_</w:t>
+      </w:r>
+      <w:r>
+        <w:rPr>
+          <w:rStyle w:val="NormalTok"/>
+        </w:rPr>
+        <w:t xml:space="preserve"> </w:t>
+      </w:r>
+      <w:r>
+        <w:rPr>
+          <w:rStyle w:val="ControlFlowTok"/>
+        </w:rPr>
+        <w:t xml:space="preserve">else</w:t>
+      </w:r>
+      <w:r>
+        <w:rPr>
+          <w:rStyle w:val="NormalTok"/>
+        </w:rPr>
+        <w:t xml:space="preserve"> lbl</w:t>
+      </w:r>
+      <w:r>
+        <w:br/>
+      </w:r>
+      <w:r>
+        <w:rPr>
+          <w:rStyle w:val="NormalTok"/>
+        </w:rPr>
+        <w:t xml:space="preserve">  }, </w:t>
+      </w:r>
+      <w:r>
+        <w:rPr>
+          <w:rStyle w:val="FunctionTok"/>
+        </w:rPr>
+        <w:t xml:space="preserve">character</w:t>
+      </w:r>
+      <w:r>
+        <w:rPr>
+          <w:rStyle w:val="NormalTok"/>
+        </w:rPr>
+        <w:t xml:space="preserve">(</w:t>
+      </w:r>
+      <w:r>
+        <w:rPr>
+          <w:rStyle w:val="DecValTok"/>
+        </w:rPr>
+        <w:t xml:space="preserve">1</w:t>
+      </w:r>
+      <w:r>
+        <w:rPr>
+          <w:rStyle w:val="NormalTok"/>
+        </w:rPr>
+        <w:t xml:space="preserve">))</w:t>
+      </w:r>
+      <w:r>
+        <w:br/>
+      </w:r>
+      <w:r>
+        <w:rPr>
+          <w:rStyle w:val="NormalTok"/>
+        </w:rPr>
+        <w:t xml:space="preserve">}</w:t>
+      </w:r>
+      <w:r>
+        <w:br/>
+      </w:r>
+      <w:r>
+        <w:rPr>
           <w:rStyle w:val="FunctionTok"/>
         </w:rPr>
         <w:t xml:space="preserve">attributes</w:t>
@@ -19145,16 +19409,331 @@
         <w:rPr>
           <w:rStyle w:val="VerbatimChar"/>
         </w:rPr>
-        <w:t xml:space="preserve">## $&lt;NA&gt;</w:t>
-      </w:r>
-      <w:r>
-        <w:br/>
-      </w:r>
-      <w:r>
-        <w:rPr>
-          <w:rStyle w:val="VerbatimChar"/>
-        </w:rPr>
-        <w:t xml:space="preserve">## NULL</w:t>
+        <w:t xml:space="preserve">## $variable.labels</w:t>
+      </w:r>
+      <w:r>
+        <w:br/>
+      </w:r>
+      <w:r>
+        <w:rPr>
+          <w:rStyle w:val="VerbatimChar"/>
+        </w:rPr>
+        <w:t xml:space="preserve">##                                                                  abbr </w:t>
+      </w:r>
+      <w:r>
+        <w:br/>
+      </w:r>
+      <w:r>
+        <w:rPr>
+          <w:rStyle w:val="VerbatimChar"/>
+        </w:rPr>
+        <w:t xml:space="preserve">##                                                  "state abbreviation" </w:t>
+      </w:r>
+      <w:r>
+        <w:br/>
+      </w:r>
+      <w:r>
+        <w:rPr>
+          <w:rStyle w:val="VerbatimChar"/>
+        </w:rPr>
+        <w:t xml:space="preserve">##                                                                 state </w:t>
+      </w:r>
+      <w:r>
+        <w:br/>
+      </w:r>
+      <w:r>
+        <w:rPr>
+          <w:rStyle w:val="VerbatimChar"/>
+        </w:rPr>
+        <w:t xml:space="preserve">##                                                          "state name" </w:t>
+      </w:r>
+      <w:r>
+        <w:br/>
+      </w:r>
+      <w:r>
+        <w:rPr>
+          <w:rStyle w:val="VerbatimChar"/>
+        </w:rPr>
+        <w:t xml:space="preserve">##                                                               edspend </w:t>
+      </w:r>
+      <w:r>
+        <w:br/>
+      </w:r>
+      <w:r>
+        <w:rPr>
+          <w:rStyle w:val="VerbatimChar"/>
+        </w:rPr>
+        <w:t xml:space="preserve">## "total spending on public primary &amp; secondary education (in $1,000s)" </w:t>
+      </w:r>
+      <w:r>
+        <w:br/>
+      </w:r>
+      <w:r>
+        <w:rPr>
+          <w:rStyle w:val="VerbatimChar"/>
+        </w:rPr>
+        <w:t xml:space="preserve">##                                                              schpopco </w:t>
+      </w:r>
+      <w:r>
+        <w:br/>
+      </w:r>
+      <w:r>
+        <w:rPr>
+          <w:rStyle w:val="VerbatimChar"/>
+        </w:rPr>
+        <w:t xml:space="preserve">##                                     "count of school-aged population" </w:t>
+      </w:r>
+      <w:r>
+        <w:br/>
+      </w:r>
+      <w:r>
+        <w:rPr>
+          <w:rStyle w:val="VerbatimChar"/>
+        </w:rPr>
+        <w:t xml:space="preserve">##                                                               read8th </w:t>
+      </w:r>
+      <w:r>
+        <w:br/>
+      </w:r>
+      <w:r>
+        <w:rPr>
+          <w:rStyle w:val="VerbatimChar"/>
+        </w:rPr>
+        <w:t xml:space="preserve">##                         "NAEP average reading scores for 8th graders" </w:t>
+      </w:r>
+      <w:r>
+        <w:br/>
+      </w:r>
+      <w:r>
+        <w:rPr>
+          <w:rStyle w:val="VerbatimChar"/>
+        </w:rPr>
+        <w:t xml:space="preserve">##                                                               math8th </w:t>
+      </w:r>
+      <w:r>
+        <w:br/>
+      </w:r>
+      <w:r>
+        <w:rPr>
+          <w:rStyle w:val="VerbatimChar"/>
+        </w:rPr>
+        <w:t xml:space="preserve">##                            "NAEP average math scores for 8th graders" </w:t>
+      </w:r>
+      <w:r>
+        <w:br/>
+      </w:r>
+      <w:r>
+        <w:rPr>
+          <w:rStyle w:val="VerbatimChar"/>
+        </w:rPr>
+        <w:t xml:space="preserve">##                                                                region </w:t>
+      </w:r>
+      <w:r>
+        <w:br/>
+      </w:r>
+      <w:r>
+        <w:rPr>
+          <w:rStyle w:val="VerbatimChar"/>
+        </w:rPr>
+        <w:t xml:space="preserve">##                                                              "region" </w:t>
+      </w:r>
+      <w:r>
+        <w:br/>
+      </w:r>
+      <w:r>
+        <w:rPr>
+          <w:rStyle w:val="VerbatimChar"/>
+        </w:rPr>
+        <w:t xml:space="preserve">##                                                               pop25co </w:t>
+      </w:r>
+      <w:r>
+        <w:br/>
+      </w:r>
+      <w:r>
+        <w:rPr>
+          <w:rStyle w:val="VerbatimChar"/>
+        </w:rPr>
+        <w:t xml:space="preserve">##                                 "count of population aged 25 or over" </w:t>
+      </w:r>
+      <w:r>
+        <w:br/>
+      </w:r>
+      <w:r>
+        <w:rPr>
+          <w:rStyle w:val="VerbatimChar"/>
+        </w:rPr>
+        <w:t xml:space="preserve">##                                                                 colco </w:t>
+      </w:r>
+      <w:r>
+        <w:br/>
+      </w:r>
+      <w:r>
+        <w:rPr>
+          <w:rStyle w:val="VerbatimChar"/>
+        </w:rPr>
+        <w:t xml:space="preserve">##               "count of population aged 25 or over w/ college degree" </w:t>
+      </w:r>
+      <w:r>
+        <w:br/>
+      </w:r>
+      <w:r>
+        <w:rPr>
+          <w:rStyle w:val="VerbatimChar"/>
+        </w:rPr>
+        <w:t xml:space="preserve">##                                                                  hsco </w:t>
+      </w:r>
+      <w:r>
+        <w:br/>
+      </w:r>
+      <w:r>
+        <w:rPr>
+          <w:rStyle w:val="VerbatimChar"/>
+        </w:rPr>
+        <w:t xml:space="preserve">##           "count of population aged 25 or over w/ high school degree" </w:t>
+      </w:r>
+      <w:r>
+        <w:br/>
+      </w:r>
+      <w:r>
+        <w:rPr>
+          <w:rStyle w:val="VerbatimChar"/>
+        </w:rPr>
+        <w:t xml:space="preserve">##                                                                 popco </w:t>
+      </w:r>
+      <w:r>
+        <w:br/>
+      </w:r>
+      <w:r>
+        <w:rPr>
+          <w:rStyle w:val="VerbatimChar"/>
+        </w:rPr>
+        <w:t xml:space="preserve">##                                                 "count of population" </w:t>
+      </w:r>
+      <w:r>
+        <w:br/>
+      </w:r>
+      <w:r>
+        <w:rPr>
+          <w:rStyle w:val="VerbatimChar"/>
+        </w:rPr>
+        <w:t xml:space="preserve">##                                                              vcrimeco </w:t>
+      </w:r>
+      <w:r>
+        <w:br/>
+      </w:r>
+      <w:r>
+        <w:rPr>
+          <w:rStyle w:val="VerbatimChar"/>
+        </w:rPr>
+        <w:t xml:space="preserve">##                                             "count of violent crimes" </w:t>
+      </w:r>
+      <w:r>
+        <w:br/>
+      </w:r>
+      <w:r>
+        <w:rPr>
+          <w:rStyle w:val="VerbatimChar"/>
+        </w:rPr>
+        <w:t xml:space="preserve">##                                                                murdco </w:t>
+      </w:r>
+      <w:r>
+        <w:br/>
+      </w:r>
+      <w:r>
+        <w:rPr>
+          <w:rStyle w:val="VerbatimChar"/>
+        </w:rPr>
+        <w:t xml:space="preserve">##                                                  "count of homicides" </w:t>
+      </w:r>
+      <w:r>
+        <w:br/>
+      </w:r>
+      <w:r>
+        <w:rPr>
+          <w:rStyle w:val="VerbatimChar"/>
+        </w:rPr>
+        <w:t xml:space="preserve">##                                                              executco </w:t>
+      </w:r>
+      <w:r>
+        <w:br/>
+      </w:r>
+      <w:r>
+        <w:rPr>
+          <w:rStyle w:val="VerbatimChar"/>
+        </w:rPr>
+        <w:t xml:space="preserve">##                                                 "count of executions" </w:t>
+      </w:r>
+      <w:r>
+        <w:br/>
+      </w:r>
+      <w:r>
+        <w:rPr>
+          <w:rStyle w:val="VerbatimChar"/>
+        </w:rPr>
+        <w:t xml:space="preserve">##                                                                   hip </w:t>
+      </w:r>
+      <w:r>
+        <w:br/>
+      </w:r>
+      <w:r>
+        <w:rPr>
+          <w:rStyle w:val="VerbatimChar"/>
+        </w:rPr>
+        <w:t xml:space="preserve">##                         "percent population lacking health insurance" </w:t>
+      </w:r>
+      <w:r>
+        <w:br/>
+      </w:r>
+      <w:r>
+        <w:rPr>
+          <w:rStyle w:val="VerbatimChar"/>
+        </w:rPr>
+        <w:t xml:space="preserve">##                                                                prisco </w:t>
+      </w:r>
+      <w:r>
+        <w:br/>
+      </w:r>
+      <w:r>
+        <w:rPr>
+          <w:rStyle w:val="VerbatimChar"/>
+        </w:rPr>
+        <w:t xml:space="preserve">##                                                  "count of prisoners" </w:t>
+      </w:r>
+      <w:r>
+        <w:br/>
+      </w:r>
+      <w:r>
+        <w:rPr>
+          <w:rStyle w:val="VerbatimChar"/>
+        </w:rPr>
+        <w:t xml:space="preserve">##                                                                  povr </w:t>
+      </w:r>
+      <w:r>
+        <w:br/>
+      </w:r>
+      <w:r>
+        <w:rPr>
+          <w:rStyle w:val="VerbatimChar"/>
+        </w:rPr>
+        <w:t xml:space="preserve">##                                                        "poverty rate" </w:t>
+      </w:r>
+      <w:r>
+        <w:br/>
+      </w:r>
+      <w:r>
+        <w:rPr>
+          <w:rStyle w:val="VerbatimChar"/>
+        </w:rPr>
+        <w:t xml:space="preserve">##                                                                   uap </w:t>
+      </w:r>
+      <w:r>
+        <w:br/>
+      </w:r>
+      <w:r>
+        <w:rPr>
+          <w:rStyle w:val="VerbatimChar"/>
+        </w:rPr>
+        <w:t xml:space="preserve">##                        "percent population living in urbanized areas"</w:t>
       </w:r>
     </w:p>
     <w:bookmarkEnd w:id="25"/>

</xml_diff>

<commit_message>
Document Problem 6 label-attribute compatibility in Lab13 final
</commit_message>
<xml_diff>
--- a/Lab13/lab13_output/Lab_13_final.docx
+++ b/Lab13/lab13_output/Lab_13_final.docx
@@ -19112,6 +19112,33 @@
       <w:pPr>
         <w:pStyle w:val="SourceCode"/>
       </w:pPr>
+      <w:r>
+        <w:rPr>
+          <w:rStyle w:val="CommentTok"/>
+        </w:rPr>
+        <w:t xml:space="preserve"># `stdata` stores labels on each column (`attr(x, "label")`) and may not include</w:t>
+      </w:r>
+      <w:r>
+        <w:br/>
+      </w:r>
+      <w:r>
+        <w:rPr>
+          <w:rStyle w:val="CommentTok"/>
+        </w:rPr>
+        <w:t xml:space="preserve"># a top-level `variable.labels` attribute in every environment. We add it once so</w:t>
+      </w:r>
+      <w:r>
+        <w:br/>
+      </w:r>
+      <w:r>
+        <w:rPr>
+          <w:rStyle w:val="CommentTok"/>
+        </w:rPr>
+        <w:t xml:space="preserve"># the taught one-liner below returns the full label set.</w:t>
+      </w:r>
+      <w:r>
+        <w:br/>
+      </w:r>
       <w:r>
         <w:rPr>
           <w:rStyle w:val="ControlFlowTok"/>

</xml_diff>

<commit_message>
Make Lab13 P6 use taught one-liner and strengthen P11 criteria text
</commit_message>
<xml_diff>
--- a/Lab13/lab13_output/Lab_13_final.docx
+++ b/Lab13/lab13_output/Lab_13_final.docx
@@ -554,6 +554,282 @@
         <w:br/>
       </w:r>
       <w:r>
+        <w:br/>
+      </w:r>
+      <w:r>
+        <w:rPr>
+          <w:rStyle w:val="CommentTok"/>
+        </w:rPr>
+        <w:t xml:space="preserve"># Compatibility: this .rda stores labels on columns, so add top-level labels once.</w:t>
+      </w:r>
+      <w:r>
+        <w:br/>
+      </w:r>
+      <w:r>
+        <w:rPr>
+          <w:rStyle w:val="ControlFlowTok"/>
+        </w:rPr>
+        <w:t xml:space="preserve">if</w:t>
+      </w:r>
+      <w:r>
+        <w:rPr>
+          <w:rStyle w:val="NormalTok"/>
+        </w:rPr>
+        <w:t xml:space="preserve"> (</w:t>
+      </w:r>
+      <w:r>
+        <w:rPr>
+          <w:rStyle w:val="FunctionTok"/>
+        </w:rPr>
+        <w:t xml:space="preserve">is.null</w:t>
+      </w:r>
+      <w:r>
+        <w:rPr>
+          <w:rStyle w:val="NormalTok"/>
+        </w:rPr>
+        <w:t xml:space="preserve">(</w:t>
+      </w:r>
+      <w:r>
+        <w:rPr>
+          <w:rStyle w:val="FunctionTok"/>
+        </w:rPr>
+        <w:t xml:space="preserve">attributes</w:t>
+      </w:r>
+      <w:r>
+        <w:rPr>
+          <w:rStyle w:val="NormalTok"/>
+        </w:rPr>
+        <w:t xml:space="preserve">(stdata)[[</w:t>
+      </w:r>
+      <w:r>
+        <w:rPr>
+          <w:rStyle w:val="StringTok"/>
+        </w:rPr>
+        <w:t xml:space="preserve">"variable.labels"</w:t>
+      </w:r>
+      <w:r>
+        <w:rPr>
+          <w:rStyle w:val="NormalTok"/>
+        </w:rPr>
+        <w:t xml:space="preserve">]])) {</w:t>
+      </w:r>
+      <w:r>
+        <w:br/>
+      </w:r>
+      <w:r>
+        <w:rPr>
+          <w:rStyle w:val="NormalTok"/>
+        </w:rPr>
+        <w:t xml:space="preserve">  </w:t>
+      </w:r>
+      <w:r>
+        <w:rPr>
+          <w:rStyle w:val="FunctionTok"/>
+        </w:rPr>
+        <w:t xml:space="preserve">attr</w:t>
+      </w:r>
+      <w:r>
+        <w:rPr>
+          <w:rStyle w:val="NormalTok"/>
+        </w:rPr>
+        <w:t xml:space="preserve">(stdata, </w:t>
+      </w:r>
+      <w:r>
+        <w:rPr>
+          <w:rStyle w:val="StringTok"/>
+        </w:rPr>
+        <w:t xml:space="preserve">"variable.labels"</w:t>
+      </w:r>
+      <w:r>
+        <w:rPr>
+          <w:rStyle w:val="NormalTok"/>
+        </w:rPr>
+        <w:t xml:space="preserve">) </w:t>
+      </w:r>
+      <w:r>
+        <w:rPr>
+          <w:rStyle w:val="OtherTok"/>
+        </w:rPr>
+        <w:t xml:space="preserve">&lt;-</w:t>
+      </w:r>
+      <w:r>
+        <w:rPr>
+          <w:rStyle w:val="NormalTok"/>
+        </w:rPr>
+        <w:t xml:space="preserve"> </w:t>
+      </w:r>
+      <w:r>
+        <w:rPr>
+          <w:rStyle w:val="FunctionTok"/>
+        </w:rPr>
+        <w:t xml:space="preserve">vapply</w:t>
+      </w:r>
+      <w:r>
+        <w:rPr>
+          <w:rStyle w:val="NormalTok"/>
+        </w:rPr>
+        <w:t xml:space="preserve">(stdata, </w:t>
+      </w:r>
+      <w:r>
+        <w:rPr>
+          <w:rStyle w:val="ControlFlowTok"/>
+        </w:rPr>
+        <w:t xml:space="preserve">function</w:t>
+      </w:r>
+      <w:r>
+        <w:rPr>
+          <w:rStyle w:val="NormalTok"/>
+        </w:rPr>
+        <w:t xml:space="preserve">(x) {</w:t>
+      </w:r>
+      <w:r>
+        <w:br/>
+      </w:r>
+      <w:r>
+        <w:rPr>
+          <w:rStyle w:val="NormalTok"/>
+        </w:rPr>
+        <w:t xml:space="preserve">    lbl </w:t>
+      </w:r>
+      <w:r>
+        <w:rPr>
+          <w:rStyle w:val="OtherTok"/>
+        </w:rPr>
+        <w:t xml:space="preserve">&lt;-</w:t>
+      </w:r>
+      <w:r>
+        <w:rPr>
+          <w:rStyle w:val="NormalTok"/>
+        </w:rPr>
+        <w:t xml:space="preserve"> </w:t>
+      </w:r>
+      <w:r>
+        <w:rPr>
+          <w:rStyle w:val="FunctionTok"/>
+        </w:rPr>
+        <w:t xml:space="preserve">attr</w:t>
+      </w:r>
+      <w:r>
+        <w:rPr>
+          <w:rStyle w:val="NormalTok"/>
+        </w:rPr>
+        <w:t xml:space="preserve">(x, </w:t>
+      </w:r>
+      <w:r>
+        <w:rPr>
+          <w:rStyle w:val="StringTok"/>
+        </w:rPr>
+        <w:t xml:space="preserve">"label"</w:t>
+      </w:r>
+      <w:r>
+        <w:rPr>
+          <w:rStyle w:val="NormalTok"/>
+        </w:rPr>
+        <w:t xml:space="preserve">)</w:t>
+      </w:r>
+      <w:r>
+        <w:br/>
+      </w:r>
+      <w:r>
+        <w:rPr>
+          <w:rStyle w:val="NormalTok"/>
+        </w:rPr>
+        <w:t xml:space="preserve">    </w:t>
+      </w:r>
+      <w:r>
+        <w:rPr>
+          <w:rStyle w:val="ControlFlowTok"/>
+        </w:rPr>
+        <w:t xml:space="preserve">if</w:t>
+      </w:r>
+      <w:r>
+        <w:rPr>
+          <w:rStyle w:val="NormalTok"/>
+        </w:rPr>
+        <w:t xml:space="preserve"> (</w:t>
+      </w:r>
+      <w:r>
+        <w:rPr>
+          <w:rStyle w:val="FunctionTok"/>
+        </w:rPr>
+        <w:t xml:space="preserve">is.null</w:t>
+      </w:r>
+      <w:r>
+        <w:rPr>
+          <w:rStyle w:val="NormalTok"/>
+        </w:rPr>
+        <w:t xml:space="preserve">(lbl)) </w:t>
+      </w:r>
+      <w:r>
+        <w:rPr>
+          <w:rStyle w:val="StringTok"/>
+        </w:rPr>
+        <w:t xml:space="preserve">""</w:t>
+      </w:r>
+      <w:r>
+        <w:rPr>
+          <w:rStyle w:val="NormalTok"/>
+        </w:rPr>
+        <w:t xml:space="preserve"> </w:t>
+      </w:r>
+      <w:r>
+        <w:rPr>
+          <w:rStyle w:val="ControlFlowTok"/>
+        </w:rPr>
+        <w:t xml:space="preserve">else</w:t>
+      </w:r>
+      <w:r>
+        <w:rPr>
+          <w:rStyle w:val="NormalTok"/>
+        </w:rPr>
+        <w:t xml:space="preserve"> lbl</w:t>
+      </w:r>
+      <w:r>
+        <w:br/>
+      </w:r>
+      <w:r>
+        <w:rPr>
+          <w:rStyle w:val="NormalTok"/>
+        </w:rPr>
+        <w:t xml:space="preserve">  }, </w:t>
+      </w:r>
+      <w:r>
+        <w:rPr>
+          <w:rStyle w:val="FunctionTok"/>
+        </w:rPr>
+        <w:t xml:space="preserve">character</w:t>
+      </w:r>
+      <w:r>
+        <w:rPr>
+          <w:rStyle w:val="NormalTok"/>
+        </w:rPr>
+        <w:t xml:space="preserve">(</w:t>
+      </w:r>
+      <w:r>
+        <w:rPr>
+          <w:rStyle w:val="DecValTok"/>
+        </w:rPr>
+        <w:t xml:space="preserve">1</w:t>
+      </w:r>
+      <w:r>
+        <w:rPr>
+          <w:rStyle w:val="NormalTok"/>
+        </w:rPr>
+        <w:t xml:space="preserve">))</w:t>
+      </w:r>
+      <w:r>
+        <w:br/>
+      </w:r>
+      <w:r>
+        <w:rPr>
+          <w:rStyle w:val="NormalTok"/>
+        </w:rPr>
+        <w:t xml:space="preserve">}</w:t>
+      </w:r>
+      <w:r>
+        <w:br/>
+      </w:r>
+      <w:r>
         <w:rPr>
           <w:rStyle w:val="FunctionTok"/>
         </w:rPr>
@@ -19112,297 +19388,6 @@
       <w:pPr>
         <w:pStyle w:val="SourceCode"/>
       </w:pPr>
-      <w:r>
-        <w:rPr>
-          <w:rStyle w:val="CommentTok"/>
-        </w:rPr>
-        <w:t xml:space="preserve"># `stdata` stores labels on each column (`attr(x, "label")`) and may not include</w:t>
-      </w:r>
-      <w:r>
-        <w:br/>
-      </w:r>
-      <w:r>
-        <w:rPr>
-          <w:rStyle w:val="CommentTok"/>
-        </w:rPr>
-        <w:t xml:space="preserve"># a top-level `variable.labels` attribute in every environment. We add it once so</w:t>
-      </w:r>
-      <w:r>
-        <w:br/>
-      </w:r>
-      <w:r>
-        <w:rPr>
-          <w:rStyle w:val="CommentTok"/>
-        </w:rPr>
-        <w:t xml:space="preserve"># the taught one-liner below returns the full label set.</w:t>
-      </w:r>
-      <w:r>
-        <w:br/>
-      </w:r>
-      <w:r>
-        <w:rPr>
-          <w:rStyle w:val="ControlFlowTok"/>
-        </w:rPr>
-        <w:t xml:space="preserve">if</w:t>
-      </w:r>
-      <w:r>
-        <w:rPr>
-          <w:rStyle w:val="NormalTok"/>
-        </w:rPr>
-        <w:t xml:space="preserve"> (</w:t>
-      </w:r>
-      <w:r>
-        <w:rPr>
-          <w:rStyle w:val="FunctionTok"/>
-        </w:rPr>
-        <w:t xml:space="preserve">is.null</w:t>
-      </w:r>
-      <w:r>
-        <w:rPr>
-          <w:rStyle w:val="NormalTok"/>
-        </w:rPr>
-        <w:t xml:space="preserve">(</w:t>
-      </w:r>
-      <w:r>
-        <w:rPr>
-          <w:rStyle w:val="FunctionTok"/>
-        </w:rPr>
-        <w:t xml:space="preserve">attributes</w:t>
-      </w:r>
-      <w:r>
-        <w:rPr>
-          <w:rStyle w:val="NormalTok"/>
-        </w:rPr>
-        <w:t xml:space="preserve">(stdata)[[</w:t>
-      </w:r>
-      <w:r>
-        <w:rPr>
-          <w:rStyle w:val="StringTok"/>
-        </w:rPr>
-        <w:t xml:space="preserve">"variable.labels"</w:t>
-      </w:r>
-      <w:r>
-        <w:rPr>
-          <w:rStyle w:val="NormalTok"/>
-        </w:rPr>
-        <w:t xml:space="preserve">]])) {</w:t>
-      </w:r>
-      <w:r>
-        <w:br/>
-      </w:r>
-      <w:r>
-        <w:rPr>
-          <w:rStyle w:val="NormalTok"/>
-        </w:rPr>
-        <w:t xml:space="preserve">  </w:t>
-      </w:r>
-      <w:r>
-        <w:rPr>
-          <w:rStyle w:val="FunctionTok"/>
-        </w:rPr>
-        <w:t xml:space="preserve">attr</w:t>
-      </w:r>
-      <w:r>
-        <w:rPr>
-          <w:rStyle w:val="NormalTok"/>
-        </w:rPr>
-        <w:t xml:space="preserve">(stdata, </w:t>
-      </w:r>
-      <w:r>
-        <w:rPr>
-          <w:rStyle w:val="StringTok"/>
-        </w:rPr>
-        <w:t xml:space="preserve">"variable.labels"</w:t>
-      </w:r>
-      <w:r>
-        <w:rPr>
-          <w:rStyle w:val="NormalTok"/>
-        </w:rPr>
-        <w:t xml:space="preserve">) </w:t>
-      </w:r>
-      <w:r>
-        <w:rPr>
-          <w:rStyle w:val="OtherTok"/>
-        </w:rPr>
-        <w:t xml:space="preserve">&lt;-</w:t>
-      </w:r>
-      <w:r>
-        <w:rPr>
-          <w:rStyle w:val="NormalTok"/>
-        </w:rPr>
-        <w:t xml:space="preserve"> </w:t>
-      </w:r>
-      <w:r>
-        <w:rPr>
-          <w:rStyle w:val="FunctionTok"/>
-        </w:rPr>
-        <w:t xml:space="preserve">vapply</w:t>
-      </w:r>
-      <w:r>
-        <w:rPr>
-          <w:rStyle w:val="NormalTok"/>
-        </w:rPr>
-        <w:t xml:space="preserve">(stdata, </w:t>
-      </w:r>
-      <w:r>
-        <w:rPr>
-          <w:rStyle w:val="ControlFlowTok"/>
-        </w:rPr>
-        <w:t xml:space="preserve">function</w:t>
-      </w:r>
-      <w:r>
-        <w:rPr>
-          <w:rStyle w:val="NormalTok"/>
-        </w:rPr>
-        <w:t xml:space="preserve">(x) {</w:t>
-      </w:r>
-      <w:r>
-        <w:br/>
-      </w:r>
-      <w:r>
-        <w:rPr>
-          <w:rStyle w:val="NormalTok"/>
-        </w:rPr>
-        <w:t xml:space="preserve">    lbl </w:t>
-      </w:r>
-      <w:r>
-        <w:rPr>
-          <w:rStyle w:val="OtherTok"/>
-        </w:rPr>
-        <w:t xml:space="preserve">&lt;-</w:t>
-      </w:r>
-      <w:r>
-        <w:rPr>
-          <w:rStyle w:val="NormalTok"/>
-        </w:rPr>
-        <w:t xml:space="preserve"> </w:t>
-      </w:r>
-      <w:r>
-        <w:rPr>
-          <w:rStyle w:val="FunctionTok"/>
-        </w:rPr>
-        <w:t xml:space="preserve">attr</w:t>
-      </w:r>
-      <w:r>
-        <w:rPr>
-          <w:rStyle w:val="NormalTok"/>
-        </w:rPr>
-        <w:t xml:space="preserve">(x, </w:t>
-      </w:r>
-      <w:r>
-        <w:rPr>
-          <w:rStyle w:val="StringTok"/>
-        </w:rPr>
-        <w:t xml:space="preserve">"label"</w:t>
-      </w:r>
-      <w:r>
-        <w:rPr>
-          <w:rStyle w:val="NormalTok"/>
-        </w:rPr>
-        <w:t xml:space="preserve">)</w:t>
-      </w:r>
-      <w:r>
-        <w:br/>
-      </w:r>
-      <w:r>
-        <w:rPr>
-          <w:rStyle w:val="NormalTok"/>
-        </w:rPr>
-        <w:t xml:space="preserve">    </w:t>
-      </w:r>
-      <w:r>
-        <w:rPr>
-          <w:rStyle w:val="ControlFlowTok"/>
-        </w:rPr>
-        <w:t xml:space="preserve">if</w:t>
-      </w:r>
-      <w:r>
-        <w:rPr>
-          <w:rStyle w:val="NormalTok"/>
-        </w:rPr>
-        <w:t xml:space="preserve"> (</w:t>
-      </w:r>
-      <w:r>
-        <w:rPr>
-          <w:rStyle w:val="FunctionTok"/>
-        </w:rPr>
-        <w:t xml:space="preserve">is.null</w:t>
-      </w:r>
-      <w:r>
-        <w:rPr>
-          <w:rStyle w:val="NormalTok"/>
-        </w:rPr>
-        <w:t xml:space="preserve">(lbl)) </w:t>
-      </w:r>
-      <w:r>
-        <w:rPr>
-          <w:rStyle w:val="ConstantTok"/>
-        </w:rPr>
-        <w:t xml:space="preserve">NA_character_</w:t>
-      </w:r>
-      <w:r>
-        <w:rPr>
-          <w:rStyle w:val="NormalTok"/>
-        </w:rPr>
-        <w:t xml:space="preserve"> </w:t>
-      </w:r>
-      <w:r>
-        <w:rPr>
-          <w:rStyle w:val="ControlFlowTok"/>
-        </w:rPr>
-        <w:t xml:space="preserve">else</w:t>
-      </w:r>
-      <w:r>
-        <w:rPr>
-          <w:rStyle w:val="NormalTok"/>
-        </w:rPr>
-        <w:t xml:space="preserve"> lbl</w:t>
-      </w:r>
-      <w:r>
-        <w:br/>
-      </w:r>
-      <w:r>
-        <w:rPr>
-          <w:rStyle w:val="NormalTok"/>
-        </w:rPr>
-        <w:t xml:space="preserve">  }, </w:t>
-      </w:r>
-      <w:r>
-        <w:rPr>
-          <w:rStyle w:val="FunctionTok"/>
-        </w:rPr>
-        <w:t xml:space="preserve">character</w:t>
-      </w:r>
-      <w:r>
-        <w:rPr>
-          <w:rStyle w:val="NormalTok"/>
-        </w:rPr>
-        <w:t xml:space="preserve">(</w:t>
-      </w:r>
-      <w:r>
-        <w:rPr>
-          <w:rStyle w:val="DecValTok"/>
-        </w:rPr>
-        <w:t xml:space="preserve">1</w:t>
-      </w:r>
-      <w:r>
-        <w:rPr>
-          <w:rStyle w:val="NormalTok"/>
-        </w:rPr>
-        <w:t xml:space="preserve">))</w:t>
-      </w:r>
-      <w:r>
-        <w:br/>
-      </w:r>
-      <w:r>
-        <w:rPr>
-          <w:rStyle w:val="NormalTok"/>
-        </w:rPr>
-        <w:t xml:space="preserve">}</w:t>
-      </w:r>
-      <w:r>
-        <w:br/>
-      </w:r>
       <w:r>
         <w:rPr>
           <w:rStyle w:val="FunctionTok"/>
@@ -23957,7 +23942,7 @@
         <w:t xml:space="preserve">p &lt; .001</w:t>
       </w:r>
       <w:r>
-        <w:t xml:space="preserve">). Departures are especially strong for homicide and execution rates (skewness</w:t>
+        <w:t xml:space="preserve">). Using the lab criterion,</w:t>
       </w:r>
       <w:r>
         <w:t xml:space="preserve"> </w:t>
@@ -23966,13 +23951,13 @@
         <w:rPr>
           <w:rStyle w:val="VerbatimChar"/>
         </w:rPr>
-        <w:t xml:space="preserve">= 4.50</w:t>
+        <w:t xml:space="preserve">skew.2SE</w:t>
       </w:r>
       <w:r>
         <w:t xml:space="preserve"> </w:t>
       </w:r>
       <w:r>
-        <w:t xml:space="preserve">and</w:t>
+        <w:t xml:space="preserve">exceeds</w:t>
       </w:r>
       <w:r>
         <w:t xml:space="preserve"> </w:t>
@@ -23981,10 +23966,43 @@
         <w:rPr>
           <w:rStyle w:val="VerbatimChar"/>
         </w:rPr>
-        <w:t xml:space="preserve">1.74</w:t>
-      </w:r>
-      <w:r>
-        <w:t xml:space="preserve">). Therefore, the preferred estimator for both relationships is the 20% Winsorized correlation.</w:t>
+        <w:t xml:space="preserve">|1|</w:t>
+      </w:r>
+      <w:r>
+        <w:t xml:space="preserve"> </w:t>
+      </w:r>
+      <w:r>
+        <w:t xml:space="preserve">for all four variables (1.64, -1.30, 6.74, 2.61), and</w:t>
+      </w:r>
+      <w:r>
+        <w:t xml:space="preserve"> </w:t>
+      </w:r>
+      <w:r>
+        <w:rPr>
+          <w:rStyle w:val="VerbatimChar"/>
+        </w:rPr>
+        <w:t xml:space="preserve">kurt.2SE</w:t>
+      </w:r>
+      <w:r>
+        <w:t xml:space="preserve"> </w:t>
+      </w:r>
+      <w:r>
+        <w:t xml:space="preserve">also exceeds</w:t>
+      </w:r>
+      <w:r>
+        <w:t xml:space="preserve"> </w:t>
+      </w:r>
+      <w:r>
+        <w:rPr>
+          <w:rStyle w:val="VerbatimChar"/>
+        </w:rPr>
+        <w:t xml:space="preserve">|1|</w:t>
+      </w:r>
+      <w:r>
+        <w:t xml:space="preserve"> </w:t>
+      </w:r>
+      <w:r>
+        <w:t xml:space="preserve">for homicide and execution rates (19.14 and 1.34). Therefore, the preferred estimator for both relationships is the 20% Winsorized correlation.</w:t>
       </w:r>
     </w:p>
     <w:bookmarkEnd w:id="49"/>

</xml_diff>